<commit_message>
Dossier de conception détaillée version finale
</commit_message>
<xml_diff>
--- a/Dossier de conception détaillée vc.docx
+++ b/Dossier de conception détaillée vc.docx
@@ -4,7 +4,7 @@
   <w:body>
     <w:p>
       <w:pPr>
-        <w:spacing w:before="2000"/>
+        <w:pStyle w:val="Titre3"/>
       </w:pPr>
     </w:p>
     <w:p>
@@ -1944,10 +1944,10 @@
       </w:pPr>
       <w:r>
         <w:drawing>
-          <wp:inline distT="0" distB="0" distL="0" distR="0" wp14:anchorId="778E0202" wp14:editId="123BD852">
-            <wp:extent cx="6120130" cy="5918200"/>
-            <wp:effectExtent l="0" t="0" r="0" b="6350"/>
-            <wp:docPr id="2" name="Image 2"/>
+          <wp:inline distT="0" distB="0" distL="0" distR="0" wp14:anchorId="771276D8" wp14:editId="28DA47FA">
+            <wp:extent cx="6120130" cy="5866765"/>
+            <wp:effectExtent l="0" t="0" r="0" b="635"/>
+            <wp:docPr id="9" name="Image 9"/>
             <wp:cNvGraphicFramePr>
               <a:graphicFrameLocks xmlns:a="http://schemas.openxmlformats.org/drawingml/2006/main" noChangeAspect="1"/>
             </wp:cNvGraphicFramePr>
@@ -1967,7 +1967,7 @@
                   <pic:spPr>
                     <a:xfrm>
                       <a:off x="0" y="0"/>
-                      <a:ext cx="6120130" cy="5918200"/>
+                      <a:ext cx="6120130" cy="5866765"/>
                     </a:xfrm>
                     <a:prstGeom prst="rect">
                       <a:avLst/>
@@ -2079,7 +2079,14 @@
           <w:sz w:val="24"/>
           <w:szCs w:val="24"/>
         </w:rPr>
-        <w:t>Le client sélectionne une tirelire ; l'API récupère et affiche les informations de celle-ci auprès de la base de données.</w:t>
+        <w:t xml:space="preserve">Le client </w:t>
+      </w:r>
+      <w:r>
+        <w:rPr>
+          <w:sz w:val="24"/>
+          <w:szCs w:val="24"/>
+        </w:rPr>
+        <w:t>demande la liste de ses tirelires.</w:t>
       </w:r>
     </w:p>
     <w:p>
@@ -2100,23 +2107,14 @@
           <w:sz w:val="24"/>
           <w:szCs w:val="24"/>
         </w:rPr>
-        <w:t>Référence</w:t>
-      </w:r>
-      <w:r>
-        <w:rPr>
-          <w:b/>
-          <w:bCs/>
-          <w:sz w:val="24"/>
-          <w:szCs w:val="24"/>
-        </w:rPr>
-        <w:t xml:space="preserve"> :</w:t>
-      </w:r>
-      <w:r>
-        <w:rPr>
-          <w:sz w:val="24"/>
-          <w:szCs w:val="24"/>
-        </w:rPr>
-        <w:t xml:space="preserve"> l'API s'assure que la tirelire appartient bien au client connecté (RG4).</w:t>
+        <w:t>L’</w:t>
+      </w:r>
+      <w:r>
+        <w:rPr>
+          <w:sz w:val="24"/>
+          <w:szCs w:val="24"/>
+        </w:rPr>
+        <w:t>API demande à la base de données la liste des tirelires appartenant au client connecté.</w:t>
       </w:r>
     </w:p>
     <w:p>
@@ -2137,7 +2135,28 @@
           <w:sz w:val="24"/>
           <w:szCs w:val="24"/>
         </w:rPr>
-        <w:t>Le client transmet une demande de dépôt, avec le montant souhaité.</w:t>
+        <w:t>L</w:t>
+      </w:r>
+      <w:r>
+        <w:rPr>
+          <w:sz w:val="24"/>
+          <w:szCs w:val="24"/>
+        </w:rPr>
+        <w:t xml:space="preserve">a </w:t>
+      </w:r>
+      <w:r>
+        <w:rPr>
+          <w:sz w:val="24"/>
+          <w:szCs w:val="24"/>
+        </w:rPr>
+        <w:t xml:space="preserve">base de données retourne la liste des </w:t>
+      </w:r>
+      <w:r>
+        <w:rPr>
+          <w:sz w:val="24"/>
+          <w:szCs w:val="24"/>
+        </w:rPr>
+        <w:t>tirelires.</w:t>
       </w:r>
     </w:p>
     <w:p>
@@ -2158,51 +2177,14 @@
           <w:sz w:val="24"/>
           <w:szCs w:val="24"/>
         </w:rPr>
-        <w:t>L'API vérifie que le montant transmis est strictement positif (RG1).</w:t>
-      </w:r>
-    </w:p>
-    <w:p>
-      <w:pPr>
-        <w:numPr>
-          <w:ilvl w:val="0"/>
-          <w:numId w:val="21"/>
-        </w:numPr>
-        <w:spacing w:before="100" w:beforeAutospacing="1" w:after="100" w:afterAutospacing="1" w:line="360" w:lineRule="auto"/>
-        <w:rPr>
-          <w:sz w:val="24"/>
-          <w:szCs w:val="24"/>
-        </w:rPr>
-      </w:pPr>
-      <w:r>
-        <w:rPr>
-          <w:sz w:val="24"/>
-          <w:szCs w:val="24"/>
-        </w:rPr>
-        <w:t>Si le montant est valide :</w:t>
-      </w:r>
-      <w:r>
-        <w:rPr>
-          <w:sz w:val="24"/>
-          <w:szCs w:val="24"/>
-        </w:rPr>
-        <w:br/>
-        <w:t>a. L'API demande à la base de données d'enregistrer l'opération de dépôt et de mettre à jour le solde.</w:t>
-      </w:r>
-      <w:r>
-        <w:rPr>
-          <w:sz w:val="24"/>
-          <w:szCs w:val="24"/>
-        </w:rPr>
-        <w:br/>
-        <w:t>b. La base de données confirme l'opération.</w:t>
-      </w:r>
-      <w:r>
-        <w:rPr>
-          <w:sz w:val="24"/>
-          <w:szCs w:val="24"/>
-        </w:rPr>
-        <w:br/>
-        <w:t>c. L'API retourne au client la confirmation du dépôt et le nouveau solde.</w:t>
+        <w:t xml:space="preserve">L'API </w:t>
+      </w:r>
+      <w:r>
+        <w:rPr>
+          <w:sz w:val="24"/>
+          <w:szCs w:val="24"/>
+        </w:rPr>
+        <w:t>retourne au client la liste de ses tirelires.</w:t>
       </w:r>
     </w:p>
     <w:p>
@@ -2223,6 +2205,141 @@
           <w:sz w:val="24"/>
           <w:szCs w:val="24"/>
         </w:rPr>
+        <w:t>Le client sélectionne la tirelire dans laquelle il souhaite effectuer un dépôt.</w:t>
+      </w:r>
+    </w:p>
+    <w:p>
+      <w:pPr>
+        <w:numPr>
+          <w:ilvl w:val="0"/>
+          <w:numId w:val="21"/>
+        </w:numPr>
+        <w:spacing w:before="100" w:beforeAutospacing="1" w:after="100" w:afterAutospacing="1" w:line="360" w:lineRule="auto"/>
+        <w:jc w:val="both"/>
+        <w:rPr>
+          <w:sz w:val="24"/>
+          <w:szCs w:val="24"/>
+        </w:rPr>
+      </w:pPr>
+      <w:r>
+        <w:rPr>
+          <w:sz w:val="24"/>
+          <w:szCs w:val="24"/>
+        </w:rPr>
+        <w:t>Le client transmet le montant du dépôt à l’API.</w:t>
+      </w:r>
+    </w:p>
+    <w:p>
+      <w:pPr>
+        <w:numPr>
+          <w:ilvl w:val="0"/>
+          <w:numId w:val="21"/>
+        </w:numPr>
+        <w:spacing w:before="100" w:beforeAutospacing="1" w:after="100" w:afterAutospacing="1" w:line="360" w:lineRule="auto"/>
+        <w:jc w:val="both"/>
+        <w:rPr>
+          <w:sz w:val="24"/>
+          <w:szCs w:val="24"/>
+        </w:rPr>
+      </w:pPr>
+      <w:r>
+        <w:rPr>
+          <w:sz w:val="24"/>
+          <w:szCs w:val="24"/>
+        </w:rPr>
+        <w:t>L’API vérifie que le montant transmis est strictement positif.</w:t>
+      </w:r>
+    </w:p>
+    <w:p>
+      <w:pPr>
+        <w:numPr>
+          <w:ilvl w:val="0"/>
+          <w:numId w:val="21"/>
+        </w:numPr>
+        <w:spacing w:before="100" w:beforeAutospacing="1" w:after="100" w:afterAutospacing="1" w:line="360" w:lineRule="auto"/>
+        <w:rPr>
+          <w:sz w:val="24"/>
+          <w:szCs w:val="24"/>
+        </w:rPr>
+      </w:pPr>
+      <w:r>
+        <w:rPr>
+          <w:sz w:val="24"/>
+          <w:szCs w:val="24"/>
+        </w:rPr>
+        <w:t>Si le montant est valide :</w:t>
+      </w:r>
+      <w:r>
+        <w:rPr>
+          <w:sz w:val="24"/>
+          <w:szCs w:val="24"/>
+        </w:rPr>
+        <w:br/>
+        <w:t>a. L'API demande à la base de données d'enregistrer l'opération de dépôt et de mettre à jour le solde</w:t>
+      </w:r>
+      <w:r>
+        <w:rPr>
+          <w:sz w:val="24"/>
+          <w:szCs w:val="24"/>
+        </w:rPr>
+        <w:t xml:space="preserve"> de la tirelire</w:t>
+      </w:r>
+      <w:r>
+        <w:rPr>
+          <w:sz w:val="24"/>
+          <w:szCs w:val="24"/>
+        </w:rPr>
+        <w:t>.</w:t>
+      </w:r>
+      <w:r>
+        <w:rPr>
+          <w:sz w:val="24"/>
+          <w:szCs w:val="24"/>
+        </w:rPr>
+        <w:br/>
+        <w:t>b. La base de données confirme l'</w:t>
+      </w:r>
+      <w:r>
+        <w:rPr>
+          <w:sz w:val="24"/>
+          <w:szCs w:val="24"/>
+        </w:rPr>
+        <w:t>enregistrement de l’opération et la mise à jour du solde</w:t>
+      </w:r>
+      <w:r>
+        <w:rPr>
+          <w:sz w:val="24"/>
+          <w:szCs w:val="24"/>
+        </w:rPr>
+        <w:t>.</w:t>
+      </w:r>
+      <w:r>
+        <w:rPr>
+          <w:sz w:val="24"/>
+          <w:szCs w:val="24"/>
+        </w:rPr>
+        <w:br/>
+        <w:t>c. L'API retourne au client la confirmation du dépôt et le nouveau solde.</w:t>
+      </w:r>
+    </w:p>
+    <w:p>
+      <w:pPr>
+        <w:numPr>
+          <w:ilvl w:val="0"/>
+          <w:numId w:val="21"/>
+        </w:numPr>
+        <w:spacing w:before="100" w:beforeAutospacing="1" w:after="100" w:afterAutospacing="1" w:line="360" w:lineRule="auto"/>
+        <w:jc w:val="both"/>
+        <w:rPr>
+          <w:sz w:val="24"/>
+          <w:szCs w:val="24"/>
+        </w:rPr>
+      </w:pPr>
+      <w:r>
+        <w:rPr>
+          <w:sz w:val="24"/>
+          <w:szCs w:val="24"/>
+        </w:rPr>
         <w:t>Sinon</w:t>
       </w:r>
       <w:r>
@@ -2272,7 +2389,14 @@
           <w:sz w:val="24"/>
           <w:szCs w:val="24"/>
         </w:rPr>
-        <w:t>RG1, RG4.</w:t>
+        <w:t>RG1</w:t>
+      </w:r>
+      <w:r>
+        <w:rPr>
+          <w:sz w:val="24"/>
+          <w:szCs w:val="24"/>
+        </w:rPr>
+        <w:t>.</w:t>
       </w:r>
     </w:p>
     <w:p>
@@ -2284,36 +2408,45 @@
           <w:szCs w:val="24"/>
         </w:rPr>
       </w:pPr>
-    </w:p>
-    <w:p>
-      <w:pPr>
-        <w:spacing w:before="100" w:beforeAutospacing="1" w:after="100" w:afterAutospacing="1" w:line="360" w:lineRule="auto"/>
-        <w:jc w:val="both"/>
-        <w:rPr>
-          <w:sz w:val="24"/>
-          <w:szCs w:val="24"/>
-        </w:rPr>
-      </w:pPr>
-    </w:p>
-    <w:p>
-      <w:pPr>
-        <w:spacing w:before="100" w:beforeAutospacing="1" w:after="100" w:afterAutospacing="1" w:line="360" w:lineRule="auto"/>
-        <w:jc w:val="both"/>
-        <w:rPr>
-          <w:sz w:val="24"/>
-          <w:szCs w:val="24"/>
-        </w:rPr>
-      </w:pPr>
-    </w:p>
-    <w:p>
-      <w:pPr>
-        <w:spacing w:before="100" w:beforeAutospacing="1" w:after="100" w:afterAutospacing="1" w:line="360" w:lineRule="auto"/>
-        <w:jc w:val="both"/>
-        <w:rPr>
-          <w:sz w:val="24"/>
-          <w:szCs w:val="24"/>
-        </w:rPr>
-      </w:pPr>
+      <w:r>
+        <w:rPr>
+          <w:b/>
+          <w:bCs/>
+          <w:sz w:val="28"/>
+          <w:szCs w:val="28"/>
+        </w:rPr>
+        <w:t>Point de conception important</w:t>
+      </w:r>
+      <w:r>
+        <w:rPr>
+          <w:b/>
+          <w:bCs/>
+          <w:sz w:val="28"/>
+          <w:szCs w:val="28"/>
+        </w:rPr>
+        <w:t xml:space="preserve"> :</w:t>
+      </w:r>
+      <w:r>
+        <w:rPr>
+          <w:sz w:val="28"/>
+          <w:szCs w:val="28"/>
+        </w:rPr>
+        <w:t xml:space="preserve"> </w:t>
+      </w:r>
+      <w:r>
+        <w:rPr>
+          <w:sz w:val="24"/>
+          <w:szCs w:val="24"/>
+        </w:rPr>
+        <w:t>l</w:t>
+      </w:r>
+      <w:r>
+        <w:rPr>
+          <w:sz w:val="24"/>
+          <w:szCs w:val="24"/>
+        </w:rPr>
+        <w:t>a liste retournée par l’API contient uniquement les tirelires du client connecté. Le client ne peut donc sélectionner, dans le flux normal, qu’une tirelire lui appartenant. La vérification de propriété n’est pas redécrite dans cette séquence.</w:t>
+      </w:r>
     </w:p>
     <w:p>
       <w:pPr>
@@ -2455,14 +2588,11 @@
         <w:jc w:val="center"/>
       </w:pPr>
       <w:r>
-        <w:rPr>
-          <w:noProof/>
-        </w:rPr>
         <w:drawing>
-          <wp:inline distT="0" distB="0" distL="0" distR="0" wp14:anchorId="534A2173" wp14:editId="22A10D29">
-            <wp:extent cx="6120130" cy="6296660"/>
-            <wp:effectExtent l="0" t="0" r="0" b="8890"/>
-            <wp:docPr id="3" name="Image 3"/>
+          <wp:inline distT="0" distB="0" distL="0" distR="0" wp14:anchorId="0EDC91A0" wp14:editId="0AAD343E">
+            <wp:extent cx="6120130" cy="5846445"/>
+            <wp:effectExtent l="0" t="0" r="0" b="1905"/>
+            <wp:docPr id="8" name="Image 8"/>
             <wp:cNvGraphicFramePr>
               <a:graphicFrameLocks xmlns:a="http://schemas.openxmlformats.org/drawingml/2006/main" noChangeAspect="1"/>
             </wp:cNvGraphicFramePr>
@@ -2482,7 +2612,7 @@
                   <pic:spPr>
                     <a:xfrm>
                       <a:off x="0" y="0"/>
-                      <a:ext cx="6120130" cy="6296660"/>
+                      <a:ext cx="6120130" cy="5846445"/>
                     </a:xfrm>
                     <a:prstGeom prst="rect">
                       <a:avLst/>
@@ -2565,276 +2695,6 @@
           <w:szCs w:val="28"/>
         </w:rPr>
       </w:pPr>
-    </w:p>
-    <w:p>
-      <w:pPr>
-        <w:spacing w:before="100" w:beforeAutospacing="1" w:after="100" w:afterAutospacing="1" w:line="360" w:lineRule="auto"/>
-        <w:jc w:val="both"/>
-        <w:rPr>
-          <w:sz w:val="28"/>
-          <w:szCs w:val="28"/>
-        </w:rPr>
-      </w:pPr>
-    </w:p>
-    <w:p>
-      <w:pPr>
-        <w:spacing w:before="100" w:beforeAutospacing="1" w:after="100" w:afterAutospacing="1" w:line="360" w:lineRule="auto"/>
-        <w:jc w:val="both"/>
-        <w:rPr>
-          <w:sz w:val="24"/>
-          <w:szCs w:val="24"/>
-        </w:rPr>
-      </w:pPr>
-      <w:r>
-        <w:rPr>
-          <w:b/>
-          <w:bCs/>
-          <w:sz w:val="28"/>
-          <w:szCs w:val="28"/>
-        </w:rPr>
-        <w:lastRenderedPageBreak/>
-        <w:t>Déroulement :</w:t>
-      </w:r>
-    </w:p>
-    <w:p>
-      <w:pPr>
-        <w:numPr>
-          <w:ilvl w:val="0"/>
-          <w:numId w:val="22"/>
-        </w:numPr>
-        <w:spacing w:before="100" w:beforeAutospacing="1" w:after="100" w:afterAutospacing="1" w:line="360" w:lineRule="auto"/>
-        <w:jc w:val="both"/>
-        <w:rPr>
-          <w:sz w:val="24"/>
-          <w:szCs w:val="24"/>
-        </w:rPr>
-      </w:pPr>
-      <w:r>
-        <w:rPr>
-          <w:sz w:val="24"/>
-          <w:szCs w:val="24"/>
-        </w:rPr>
-        <w:t>Le client sélectionne une tirelire ; l'API récupère et affiche les informations de celle-ci auprès de la base de données.</w:t>
-      </w:r>
-    </w:p>
-    <w:p>
-      <w:pPr>
-        <w:numPr>
-          <w:ilvl w:val="0"/>
-          <w:numId w:val="22"/>
-        </w:numPr>
-        <w:spacing w:before="100" w:beforeAutospacing="1" w:after="100" w:afterAutospacing="1" w:line="360" w:lineRule="auto"/>
-        <w:jc w:val="both"/>
-        <w:rPr>
-          <w:sz w:val="24"/>
-          <w:szCs w:val="24"/>
-        </w:rPr>
-      </w:pPr>
-      <w:r>
-        <w:rPr>
-          <w:sz w:val="24"/>
-          <w:szCs w:val="24"/>
-        </w:rPr>
-        <w:t>Le client transmet une demande de retrait, avec le montant souhaité.</w:t>
-      </w:r>
-    </w:p>
-    <w:p>
-      <w:pPr>
-        <w:numPr>
-          <w:ilvl w:val="0"/>
-          <w:numId w:val="22"/>
-        </w:numPr>
-        <w:spacing w:before="100" w:beforeAutospacing="1" w:after="100" w:afterAutospacing="1" w:line="360" w:lineRule="auto"/>
-        <w:jc w:val="both"/>
-        <w:rPr>
-          <w:sz w:val="24"/>
-          <w:szCs w:val="24"/>
-        </w:rPr>
-      </w:pPr>
-      <w:r>
-        <w:rPr>
-          <w:sz w:val="24"/>
-          <w:szCs w:val="24"/>
-        </w:rPr>
-        <w:t>Référence</w:t>
-      </w:r>
-      <w:r>
-        <w:rPr>
-          <w:b/>
-          <w:bCs/>
-          <w:sz w:val="24"/>
-          <w:szCs w:val="24"/>
-        </w:rPr>
-        <w:t xml:space="preserve"> :</w:t>
-      </w:r>
-      <w:r>
-        <w:rPr>
-          <w:sz w:val="24"/>
-          <w:szCs w:val="24"/>
-        </w:rPr>
-        <w:t xml:space="preserve"> l'API</w:t>
-      </w:r>
-      <w:r>
-        <w:rPr>
-          <w:sz w:val="24"/>
-          <w:szCs w:val="24"/>
-        </w:rPr>
-        <w:t xml:space="preserve"> </w:t>
-      </w:r>
-      <w:r>
-        <w:rPr>
-          <w:sz w:val="24"/>
-          <w:szCs w:val="24"/>
-        </w:rPr>
-        <w:t>s'assure que la tirelire appartient bien au client connecté (RG4).</w:t>
-      </w:r>
-    </w:p>
-    <w:p>
-      <w:pPr>
-        <w:numPr>
-          <w:ilvl w:val="0"/>
-          <w:numId w:val="22"/>
-        </w:numPr>
-        <w:spacing w:before="100" w:beforeAutospacing="1" w:after="100" w:afterAutospacing="1" w:line="360" w:lineRule="auto"/>
-        <w:jc w:val="both"/>
-        <w:rPr>
-          <w:sz w:val="24"/>
-          <w:szCs w:val="24"/>
-        </w:rPr>
-      </w:pPr>
-      <w:r>
-        <w:rPr>
-          <w:sz w:val="24"/>
-          <w:szCs w:val="24"/>
-        </w:rPr>
-        <w:t>L'API vérifie, dans l'ordre : que le montant transmis est strictement positif (RG1), que le solde disponible est suffisant pour couvrir le retrait (RG2), et que l'objectif est atteint ou l'échéance dépassée (RG3).</w:t>
-      </w:r>
-    </w:p>
-    <w:p>
-      <w:pPr>
-        <w:numPr>
-          <w:ilvl w:val="0"/>
-          <w:numId w:val="22"/>
-        </w:numPr>
-        <w:spacing w:before="100" w:beforeAutospacing="1" w:after="100" w:afterAutospacing="1" w:line="360" w:lineRule="auto"/>
-        <w:rPr>
-          <w:sz w:val="24"/>
-          <w:szCs w:val="24"/>
-        </w:rPr>
-      </w:pPr>
-      <w:r>
-        <w:rPr>
-          <w:sz w:val="24"/>
-          <w:szCs w:val="24"/>
-        </w:rPr>
-        <w:t>Si les trois conditions sont réunies :</w:t>
-      </w:r>
-      <w:r>
-        <w:rPr>
-          <w:sz w:val="24"/>
-          <w:szCs w:val="24"/>
-        </w:rPr>
-        <w:br/>
-        <w:t>a. L'API demande à la base de données d'enregistrer l'opération de retrait et de mettre à jour le solde.</w:t>
-      </w:r>
-      <w:r>
-        <w:rPr>
-          <w:sz w:val="24"/>
-          <w:szCs w:val="24"/>
-        </w:rPr>
-        <w:br/>
-        <w:t>b. La base de données confirme l'opération.</w:t>
-      </w:r>
-      <w:r>
-        <w:rPr>
-          <w:sz w:val="24"/>
-          <w:szCs w:val="24"/>
-        </w:rPr>
-        <w:br/>
-        <w:t>c. L'API retourne au client la confirmation du retrait et le nouveau solde.</w:t>
-      </w:r>
-    </w:p>
-    <w:p>
-      <w:pPr>
-        <w:numPr>
-          <w:ilvl w:val="0"/>
-          <w:numId w:val="22"/>
-        </w:numPr>
-        <w:spacing w:before="100" w:beforeAutospacing="1" w:after="100" w:afterAutospacing="1" w:line="360" w:lineRule="auto"/>
-        <w:jc w:val="both"/>
-        <w:rPr>
-          <w:sz w:val="24"/>
-          <w:szCs w:val="24"/>
-        </w:rPr>
-      </w:pPr>
-      <w:r>
-        <w:rPr>
-          <w:sz w:val="24"/>
-          <w:szCs w:val="24"/>
-        </w:rPr>
-        <w:t>Sinon</w:t>
-      </w:r>
-      <w:r>
-        <w:rPr>
-          <w:b/>
-          <w:bCs/>
-          <w:sz w:val="24"/>
-          <w:szCs w:val="24"/>
-        </w:rPr>
-        <w:t xml:space="preserve"> :</w:t>
-      </w:r>
-      <w:r>
-        <w:rPr>
-          <w:sz w:val="24"/>
-          <w:szCs w:val="24"/>
-        </w:rPr>
-        <w:t xml:space="preserve"> l'API retourne un message d'échec, précisant laquelle des trois règles n'est pas respectée.</w:t>
-      </w:r>
-    </w:p>
-    <w:p>
-      <w:pPr>
-        <w:spacing w:before="100" w:beforeAutospacing="1" w:after="100" w:afterAutospacing="1" w:line="360" w:lineRule="auto"/>
-        <w:jc w:val="both"/>
-        <w:rPr>
-          <w:sz w:val="24"/>
-          <w:szCs w:val="24"/>
-        </w:rPr>
-      </w:pPr>
-      <w:r>
-        <w:rPr>
-          <w:b/>
-          <w:bCs/>
-          <w:sz w:val="28"/>
-          <w:szCs w:val="28"/>
-        </w:rPr>
-        <w:t>Règles de gestion associées :</w:t>
-      </w:r>
-      <w:r>
-        <w:rPr>
-          <w:sz w:val="28"/>
-          <w:szCs w:val="28"/>
-        </w:rPr>
-        <w:t xml:space="preserve"> </w:t>
-      </w:r>
-      <w:r>
-        <w:rPr>
-          <w:sz w:val="24"/>
-          <w:szCs w:val="24"/>
-        </w:rPr>
-        <w:t>RG1, RG2, RG3, RG4.</w:t>
-      </w:r>
-    </w:p>
-    <w:p>
-      <w:pPr>
-        <w:pStyle w:val="Titre2"/>
-        <w:spacing w:before="300" w:after="150" w:line="360" w:lineRule="auto"/>
-        <w:ind w:firstLine="708"/>
-        <w:jc w:val="both"/>
-        <w:rPr>
-          <w:sz w:val="28"/>
-          <w:szCs w:val="28"/>
-        </w:rPr>
-      </w:pPr>
       <w:bookmarkStart w:id="38" w:name="_Toc238553120"/>
       <w:bookmarkStart w:id="39" w:name="_Toc238553170"/>
       <w:bookmarkStart w:id="40" w:name="_Toc238553210"/>
@@ -2842,6 +2702,557 @@
       <w:bookmarkStart w:id="42" w:name="_Toc239101024"/>
       <w:r>
         <w:rPr>
+          <w:b/>
+          <w:bCs/>
+          <w:sz w:val="28"/>
+          <w:szCs w:val="28"/>
+        </w:rPr>
+        <w:t>Déroulement :</w:t>
+      </w:r>
+    </w:p>
+    <w:p>
+      <w:pPr>
+        <w:numPr>
+          <w:ilvl w:val="0"/>
+          <w:numId w:val="21"/>
+        </w:numPr>
+        <w:spacing w:before="100" w:beforeAutospacing="1" w:after="100" w:afterAutospacing="1" w:line="360" w:lineRule="auto"/>
+        <w:jc w:val="both"/>
+        <w:rPr>
+          <w:sz w:val="24"/>
+          <w:szCs w:val="24"/>
+        </w:rPr>
+      </w:pPr>
+      <w:r>
+        <w:rPr>
+          <w:sz w:val="24"/>
+          <w:szCs w:val="24"/>
+        </w:rPr>
+        <w:t xml:space="preserve">Le client </w:t>
+      </w:r>
+      <w:r>
+        <w:rPr>
+          <w:sz w:val="24"/>
+          <w:szCs w:val="24"/>
+        </w:rPr>
+        <w:t>demande la liste de ses tirelires.</w:t>
+      </w:r>
+    </w:p>
+    <w:p>
+      <w:pPr>
+        <w:numPr>
+          <w:ilvl w:val="0"/>
+          <w:numId w:val="21"/>
+        </w:numPr>
+        <w:spacing w:before="100" w:beforeAutospacing="1" w:after="100" w:afterAutospacing="1" w:line="360" w:lineRule="auto"/>
+        <w:jc w:val="both"/>
+        <w:rPr>
+          <w:sz w:val="24"/>
+          <w:szCs w:val="24"/>
+        </w:rPr>
+      </w:pPr>
+      <w:r>
+        <w:rPr>
+          <w:sz w:val="24"/>
+          <w:szCs w:val="24"/>
+        </w:rPr>
+        <w:t>L’API demande à la base de données la liste des tirelires appartenant au client connecté.</w:t>
+      </w:r>
+    </w:p>
+    <w:p>
+      <w:pPr>
+        <w:numPr>
+          <w:ilvl w:val="0"/>
+          <w:numId w:val="21"/>
+        </w:numPr>
+        <w:spacing w:before="100" w:beforeAutospacing="1" w:after="100" w:afterAutospacing="1" w:line="360" w:lineRule="auto"/>
+        <w:jc w:val="both"/>
+        <w:rPr>
+          <w:sz w:val="24"/>
+          <w:szCs w:val="24"/>
+        </w:rPr>
+      </w:pPr>
+      <w:r>
+        <w:rPr>
+          <w:sz w:val="24"/>
+          <w:szCs w:val="24"/>
+        </w:rPr>
+        <w:t xml:space="preserve">La base de données retourne la liste des </w:t>
+      </w:r>
+      <w:r>
+        <w:rPr>
+          <w:sz w:val="24"/>
+          <w:szCs w:val="24"/>
+        </w:rPr>
+        <w:t>tirelires.</w:t>
+      </w:r>
+    </w:p>
+    <w:p>
+      <w:pPr>
+        <w:numPr>
+          <w:ilvl w:val="0"/>
+          <w:numId w:val="21"/>
+        </w:numPr>
+        <w:spacing w:before="100" w:beforeAutospacing="1" w:after="100" w:afterAutospacing="1" w:line="360" w:lineRule="auto"/>
+        <w:jc w:val="both"/>
+        <w:rPr>
+          <w:sz w:val="24"/>
+          <w:szCs w:val="24"/>
+        </w:rPr>
+      </w:pPr>
+      <w:r>
+        <w:rPr>
+          <w:sz w:val="24"/>
+          <w:szCs w:val="24"/>
+        </w:rPr>
+        <w:lastRenderedPageBreak/>
+        <w:t xml:space="preserve">L'API </w:t>
+      </w:r>
+      <w:r>
+        <w:rPr>
+          <w:sz w:val="24"/>
+          <w:szCs w:val="24"/>
+        </w:rPr>
+        <w:t>retourne au client la liste de ses tirelires.</w:t>
+      </w:r>
+    </w:p>
+    <w:p>
+      <w:pPr>
+        <w:numPr>
+          <w:ilvl w:val="0"/>
+          <w:numId w:val="21"/>
+        </w:numPr>
+        <w:spacing w:before="100" w:beforeAutospacing="1" w:after="100" w:afterAutospacing="1" w:line="360" w:lineRule="auto"/>
+        <w:jc w:val="both"/>
+        <w:rPr>
+          <w:sz w:val="24"/>
+          <w:szCs w:val="24"/>
+        </w:rPr>
+      </w:pPr>
+      <w:r>
+        <w:rPr>
+          <w:sz w:val="24"/>
+          <w:szCs w:val="24"/>
+        </w:rPr>
+        <w:t>Le client sélectionne la tirelire dans laquelle il souhaite effectuer un</w:t>
+      </w:r>
+      <w:r>
+        <w:rPr>
+          <w:sz w:val="24"/>
+          <w:szCs w:val="24"/>
+        </w:rPr>
+        <w:t xml:space="preserve"> retrait</w:t>
+      </w:r>
+      <w:r>
+        <w:rPr>
+          <w:sz w:val="24"/>
+          <w:szCs w:val="24"/>
+        </w:rPr>
+        <w:t>.</w:t>
+      </w:r>
+    </w:p>
+    <w:p>
+      <w:pPr>
+        <w:numPr>
+          <w:ilvl w:val="0"/>
+          <w:numId w:val="21"/>
+        </w:numPr>
+        <w:spacing w:before="100" w:beforeAutospacing="1" w:after="100" w:afterAutospacing="1" w:line="360" w:lineRule="auto"/>
+        <w:jc w:val="both"/>
+        <w:rPr>
+          <w:sz w:val="24"/>
+          <w:szCs w:val="24"/>
+        </w:rPr>
+      </w:pPr>
+      <w:r>
+        <w:rPr>
+          <w:sz w:val="24"/>
+          <w:szCs w:val="24"/>
+        </w:rPr>
+        <w:t xml:space="preserve">Le client transmet le montant du </w:t>
+      </w:r>
+      <w:r>
+        <w:rPr>
+          <w:sz w:val="24"/>
+          <w:szCs w:val="24"/>
+        </w:rPr>
+        <w:t>retrait</w:t>
+      </w:r>
+      <w:r>
+        <w:rPr>
+          <w:sz w:val="24"/>
+          <w:szCs w:val="24"/>
+        </w:rPr>
+        <w:t xml:space="preserve"> à l’API.</w:t>
+      </w:r>
+      <w:r>
+        <w:rPr>
+          <w:sz w:val="24"/>
+          <w:szCs w:val="24"/>
+        </w:rPr>
+        <w:t xml:space="preserve"> </w:t>
+      </w:r>
+    </w:p>
+    <w:p>
+      <w:pPr>
+        <w:numPr>
+          <w:ilvl w:val="0"/>
+          <w:numId w:val="21"/>
+        </w:numPr>
+        <w:spacing w:before="100" w:beforeAutospacing="1" w:after="100" w:afterAutospacing="1" w:line="360" w:lineRule="auto"/>
+        <w:rPr>
+          <w:sz w:val="24"/>
+          <w:szCs w:val="24"/>
+        </w:rPr>
+      </w:pPr>
+      <w:r>
+        <w:rPr>
+          <w:sz w:val="24"/>
+          <w:szCs w:val="24"/>
+        </w:rPr>
+        <w:t>L’API vérifie dans l’ordre</w:t>
+      </w:r>
+      <w:r>
+        <w:rPr>
+          <w:sz w:val="24"/>
+          <w:szCs w:val="24"/>
+        </w:rPr>
+        <w:t xml:space="preserve"> :</w:t>
+      </w:r>
+      <w:r>
+        <w:rPr>
+          <w:sz w:val="24"/>
+          <w:szCs w:val="24"/>
+        </w:rPr>
+        <w:br/>
+        <w:t xml:space="preserve">a. </w:t>
+      </w:r>
+      <w:r>
+        <w:rPr>
+          <w:sz w:val="24"/>
+          <w:szCs w:val="24"/>
+        </w:rPr>
+        <w:t>Que le montant transmis est strictement positif</w:t>
+      </w:r>
+      <w:r>
+        <w:rPr>
+          <w:sz w:val="24"/>
+          <w:szCs w:val="24"/>
+        </w:rPr>
+        <w:t>.</w:t>
+      </w:r>
+      <w:r>
+        <w:rPr>
+          <w:sz w:val="24"/>
+          <w:szCs w:val="24"/>
+        </w:rPr>
+        <w:br/>
+        <w:t xml:space="preserve">b. </w:t>
+      </w:r>
+      <w:r>
+        <w:rPr>
+          <w:sz w:val="24"/>
+          <w:szCs w:val="24"/>
+        </w:rPr>
+        <w:t>Que le solde disponible est suffisant pour couvrir le retrait</w:t>
+      </w:r>
+      <w:r>
+        <w:rPr>
+          <w:sz w:val="24"/>
+          <w:szCs w:val="24"/>
+        </w:rPr>
+        <w:t>.</w:t>
+      </w:r>
+      <w:r>
+        <w:rPr>
+          <w:sz w:val="24"/>
+          <w:szCs w:val="24"/>
+        </w:rPr>
+        <w:br/>
+        <w:t xml:space="preserve">c. </w:t>
+      </w:r>
+      <w:r>
+        <w:rPr>
+          <w:sz w:val="24"/>
+          <w:szCs w:val="24"/>
+        </w:rPr>
+        <w:t>Que l’objectif est atteint ou que l’échéance est dépassée</w:t>
+      </w:r>
+      <w:r>
+        <w:rPr>
+          <w:sz w:val="24"/>
+          <w:szCs w:val="24"/>
+        </w:rPr>
+        <w:t>.</w:t>
+      </w:r>
+    </w:p>
+    <w:p>
+      <w:pPr>
+        <w:numPr>
+          <w:ilvl w:val="0"/>
+          <w:numId w:val="21"/>
+        </w:numPr>
+        <w:spacing w:before="100" w:beforeAutospacing="1" w:after="100" w:afterAutospacing="1" w:line="360" w:lineRule="auto"/>
+        <w:rPr>
+          <w:sz w:val="24"/>
+          <w:szCs w:val="24"/>
+        </w:rPr>
+      </w:pPr>
+      <w:r>
+        <w:rPr>
+          <w:sz w:val="24"/>
+          <w:szCs w:val="24"/>
+        </w:rPr>
+        <w:t>Si le</w:t>
+      </w:r>
+      <w:r>
+        <w:rPr>
+          <w:sz w:val="24"/>
+          <w:szCs w:val="24"/>
+        </w:rPr>
+        <w:t>s conditions sont réunies</w:t>
+      </w:r>
+      <w:r>
+        <w:rPr>
+          <w:sz w:val="24"/>
+          <w:szCs w:val="24"/>
+        </w:rPr>
+        <w:t xml:space="preserve"> :</w:t>
+      </w:r>
+      <w:r>
+        <w:rPr>
+          <w:sz w:val="24"/>
+          <w:szCs w:val="24"/>
+        </w:rPr>
+        <w:br/>
+        <w:t xml:space="preserve">a. L'API demande à la base de données d'enregistrer l'opération de </w:t>
+      </w:r>
+      <w:r>
+        <w:rPr>
+          <w:sz w:val="24"/>
+          <w:szCs w:val="24"/>
+        </w:rPr>
+        <w:t>retrait</w:t>
+      </w:r>
+      <w:r>
+        <w:rPr>
+          <w:sz w:val="24"/>
+          <w:szCs w:val="24"/>
+        </w:rPr>
+        <w:t xml:space="preserve"> et de mettre à jour le solde</w:t>
+      </w:r>
+      <w:r>
+        <w:rPr>
+          <w:sz w:val="24"/>
+          <w:szCs w:val="24"/>
+        </w:rPr>
+        <w:t xml:space="preserve"> de la tirelire</w:t>
+      </w:r>
+      <w:r>
+        <w:rPr>
+          <w:sz w:val="24"/>
+          <w:szCs w:val="24"/>
+        </w:rPr>
+        <w:t>.</w:t>
+      </w:r>
+      <w:r>
+        <w:rPr>
+          <w:sz w:val="24"/>
+          <w:szCs w:val="24"/>
+        </w:rPr>
+        <w:br/>
+        <w:t>b. La base de données confirme l'</w:t>
+      </w:r>
+      <w:r>
+        <w:rPr>
+          <w:sz w:val="24"/>
+          <w:szCs w:val="24"/>
+        </w:rPr>
+        <w:t>enregistrement de l’opération et la mise à jour du solde</w:t>
+      </w:r>
+      <w:r>
+        <w:rPr>
+          <w:sz w:val="24"/>
+          <w:szCs w:val="24"/>
+        </w:rPr>
+        <w:t>.</w:t>
+      </w:r>
+      <w:r>
+        <w:rPr>
+          <w:sz w:val="24"/>
+          <w:szCs w:val="24"/>
+        </w:rPr>
+        <w:br/>
+        <w:t xml:space="preserve">c. L'API retourne au client la confirmation du </w:t>
+      </w:r>
+      <w:r>
+        <w:rPr>
+          <w:sz w:val="24"/>
+          <w:szCs w:val="24"/>
+        </w:rPr>
+        <w:t>retrait</w:t>
+      </w:r>
+      <w:r>
+        <w:rPr>
+          <w:sz w:val="24"/>
+          <w:szCs w:val="24"/>
+        </w:rPr>
+        <w:t xml:space="preserve"> et le nouveau solde.</w:t>
+      </w:r>
+    </w:p>
+    <w:p>
+      <w:pPr>
+        <w:numPr>
+          <w:ilvl w:val="0"/>
+          <w:numId w:val="21"/>
+        </w:numPr>
+        <w:spacing w:before="100" w:beforeAutospacing="1" w:after="100" w:afterAutospacing="1" w:line="360" w:lineRule="auto"/>
+        <w:jc w:val="both"/>
+        <w:rPr>
+          <w:sz w:val="24"/>
+          <w:szCs w:val="24"/>
+        </w:rPr>
+      </w:pPr>
+      <w:r>
+        <w:rPr>
+          <w:sz w:val="24"/>
+          <w:szCs w:val="24"/>
+        </w:rPr>
+        <w:t>Sinon</w:t>
+      </w:r>
+      <w:r>
+        <w:rPr>
+          <w:b/>
+          <w:bCs/>
+          <w:sz w:val="24"/>
+          <w:szCs w:val="24"/>
+        </w:rPr>
+        <w:t xml:space="preserve"> :</w:t>
+      </w:r>
+      <w:r>
+        <w:rPr>
+          <w:sz w:val="24"/>
+          <w:szCs w:val="24"/>
+        </w:rPr>
+        <w:t xml:space="preserve"> l'API retourne un message d'échec, précisant </w:t>
+      </w:r>
+      <w:r>
+        <w:rPr>
+          <w:sz w:val="24"/>
+          <w:szCs w:val="24"/>
+        </w:rPr>
+        <w:t>la règle qui n’est pas respectée</w:t>
+      </w:r>
+      <w:r>
+        <w:rPr>
+          <w:sz w:val="24"/>
+          <w:szCs w:val="24"/>
+        </w:rPr>
+        <w:t>.</w:t>
+      </w:r>
+    </w:p>
+    <w:p>
+      <w:pPr>
+        <w:spacing w:before="100" w:beforeAutospacing="1" w:after="100" w:afterAutospacing="1" w:line="360" w:lineRule="auto"/>
+        <w:jc w:val="both"/>
+        <w:rPr>
+          <w:sz w:val="24"/>
+          <w:szCs w:val="24"/>
+        </w:rPr>
+      </w:pPr>
+      <w:r>
+        <w:rPr>
+          <w:b/>
+          <w:bCs/>
+          <w:sz w:val="28"/>
+          <w:szCs w:val="28"/>
+        </w:rPr>
+        <w:t>Règles de gestion associées :</w:t>
+      </w:r>
+      <w:r>
+        <w:rPr>
+          <w:sz w:val="28"/>
+          <w:szCs w:val="28"/>
+        </w:rPr>
+        <w:t xml:space="preserve"> </w:t>
+      </w:r>
+      <w:r>
+        <w:rPr>
+          <w:sz w:val="24"/>
+          <w:szCs w:val="24"/>
+        </w:rPr>
+        <w:t>RG1</w:t>
+      </w:r>
+      <w:r>
+        <w:rPr>
+          <w:sz w:val="24"/>
+          <w:szCs w:val="24"/>
+        </w:rPr>
+        <w:t>, RG2, RG3</w:t>
+      </w:r>
+      <w:r>
+        <w:rPr>
+          <w:sz w:val="24"/>
+          <w:szCs w:val="24"/>
+        </w:rPr>
+        <w:t>.</w:t>
+      </w:r>
+    </w:p>
+    <w:p>
+      <w:pPr>
+        <w:spacing w:before="100" w:beforeAutospacing="1" w:after="100" w:afterAutospacing="1" w:line="360" w:lineRule="auto"/>
+        <w:jc w:val="both"/>
+        <w:rPr>
+          <w:sz w:val="24"/>
+          <w:szCs w:val="24"/>
+        </w:rPr>
+      </w:pPr>
+      <w:r>
+        <w:rPr>
+          <w:b/>
+          <w:bCs/>
+          <w:sz w:val="28"/>
+          <w:szCs w:val="28"/>
+        </w:rPr>
+        <w:t>Point de conception important</w:t>
+      </w:r>
+      <w:r>
+        <w:rPr>
+          <w:b/>
+          <w:bCs/>
+          <w:sz w:val="28"/>
+          <w:szCs w:val="28"/>
+        </w:rPr>
+        <w:t xml:space="preserve"> :</w:t>
+      </w:r>
+      <w:r>
+        <w:rPr>
+          <w:sz w:val="28"/>
+          <w:szCs w:val="28"/>
+        </w:rPr>
+        <w:t xml:space="preserve"> </w:t>
+      </w:r>
+      <w:r>
+        <w:rPr>
+          <w:sz w:val="24"/>
+          <w:szCs w:val="24"/>
+        </w:rPr>
+        <w:t>la liste retournée par l’API contient uniquement les tirelires du client connecté. Le client ne peut donc sélectionner, dans le flux normal, qu’une tirelire lui appartenant. La vérification de propriété n’est pas redécrite dans cette séquence.</w:t>
+      </w:r>
+    </w:p>
+    <w:p>
+      <w:pPr>
+        <w:pStyle w:val="Titre2"/>
+        <w:spacing w:before="300" w:after="150" w:line="360" w:lineRule="auto"/>
+        <w:ind w:firstLine="708"/>
+        <w:jc w:val="both"/>
+        <w:rPr>
+          <w:sz w:val="28"/>
+          <w:szCs w:val="28"/>
+        </w:rPr>
+      </w:pPr>
+      <w:r>
+        <w:rPr>
           <w:rFonts w:eastAsia="Calibri"/>
           <w:b/>
           <w:bCs/>
@@ -2893,10 +3304,13 @@
         <w:jc w:val="center"/>
       </w:pPr>
       <w:r>
+        <w:rPr>
+          <w:noProof/>
+        </w:rPr>
         <w:drawing>
-          <wp:inline distT="0" distB="0" distL="0" distR="0" wp14:anchorId="01D24D2E" wp14:editId="1BC752C4">
-            <wp:extent cx="4067909" cy="3817620"/>
-            <wp:effectExtent l="0" t="0" r="8890" b="0"/>
+          <wp:inline distT="0" distB="0" distL="0" distR="0" wp14:anchorId="01D24D2E" wp14:editId="04EDBA2C">
+            <wp:extent cx="3450820" cy="3238500"/>
+            <wp:effectExtent l="0" t="0" r="0" b="0"/>
             <wp:docPr id="4" name="Image 4"/>
             <wp:cNvGraphicFramePr>
               <a:graphicFrameLocks xmlns:a="http://schemas.openxmlformats.org/drawingml/2006/main" noChangeAspect="1"/>
@@ -2917,7 +3331,7 @@
                   <pic:spPr>
                     <a:xfrm>
                       <a:off x="0" y="0"/>
-                      <a:ext cx="4077546" cy="3826664"/>
+                      <a:ext cx="3463616" cy="3250509"/>
                     </a:xfrm>
                     <a:prstGeom prst="rect">
                       <a:avLst/>
@@ -3311,6 +3725,7 @@
       <w:r>
         <w:rPr>
           <w:rFonts w:eastAsia="Calibri"/>
+          <w:noProof/>
         </w:rPr>
         <w:drawing>
           <wp:inline distT="0" distB="0" distL="0" distR="0" wp14:anchorId="5C084879" wp14:editId="3457F7B4">
@@ -4032,14 +4447,7 @@
                 <w:sz w:val="24"/>
                 <w:szCs w:val="24"/>
               </w:rPr>
-              <w:t>Déb</w:t>
-            </w:r>
-            <w:r>
-              <w:rPr>
-                <w:sz w:val="24"/>
-                <w:szCs w:val="24"/>
-              </w:rPr>
-              <w:t>loquée</w:t>
+              <w:t>Débloquée</w:t>
             </w:r>
           </w:p>
         </w:tc>
@@ -4068,21 +4476,7 @@
                 <w:sz w:val="24"/>
                 <w:szCs w:val="24"/>
               </w:rPr>
-              <w:t>Déb</w:t>
-            </w:r>
-            <w:r>
-              <w:rPr>
-                <w:sz w:val="24"/>
-                <w:szCs w:val="24"/>
-              </w:rPr>
-              <w:t>loqu</w:t>
-            </w:r>
-            <w:r>
-              <w:rPr>
-                <w:sz w:val="24"/>
-                <w:szCs w:val="24"/>
-              </w:rPr>
-              <w:t>er</w:t>
+              <w:t>Débloquer</w:t>
             </w:r>
             <w:r>
               <w:rPr>
@@ -4175,14 +4569,7 @@
                 <w:sz w:val="24"/>
                 <w:szCs w:val="24"/>
               </w:rPr>
-              <w:t>Déb</w:t>
-            </w:r>
-            <w:r>
-              <w:rPr>
-                <w:sz w:val="24"/>
-                <w:szCs w:val="24"/>
-              </w:rPr>
-              <w:t>loquée</w:t>
+              <w:t>Débloquée</w:t>
             </w:r>
           </w:p>
         </w:tc>
@@ -4252,14 +4639,7 @@
                 <w:sz w:val="24"/>
                 <w:szCs w:val="24"/>
               </w:rPr>
-              <w:t>Déb</w:t>
-            </w:r>
-            <w:r>
-              <w:rPr>
-                <w:sz w:val="24"/>
-                <w:szCs w:val="24"/>
-              </w:rPr>
-              <w:t>loquée</w:t>
+              <w:t>Débloquée</w:t>
             </w:r>
           </w:p>
         </w:tc>
@@ -5079,9 +5459,9 @@
       <w:bookmarkStart w:id="87" w:name="_Toc238553127"/>
       <w:bookmarkStart w:id="88" w:name="_Toc238553177"/>
       <w:bookmarkStart w:id="89" w:name="_Toc238553217"/>
-      <w:bookmarkStart w:id="90" w:name="_Toc238413442"/>
-      <w:bookmarkStart w:id="91" w:name="_Toc239100948"/>
-      <w:bookmarkStart w:id="92" w:name="_Toc239101031"/>
+      <w:bookmarkStart w:id="90" w:name="_Toc239100948"/>
+      <w:bookmarkStart w:id="91" w:name="_Toc239101031"/>
+      <w:bookmarkStart w:id="92" w:name="_Toc238413442"/>
       <w:r>
         <w:rPr>
           <w:rFonts w:eastAsia="Calibri"/>
@@ -5105,8 +5485,8 @@
       <w:bookmarkEnd w:id="87"/>
       <w:bookmarkEnd w:id="88"/>
       <w:bookmarkEnd w:id="89"/>
+      <w:bookmarkEnd w:id="90"/>
       <w:bookmarkEnd w:id="91"/>
-      <w:bookmarkEnd w:id="92"/>
     </w:p>
     <w:p>
       <w:pPr>
@@ -5172,7 +5552,7 @@
         </w:rPr>
         <w:t xml:space="preserve"> </w:t>
       </w:r>
-      <w:bookmarkEnd w:id="90"/>
+      <w:bookmarkEnd w:id="92"/>
       <w:r>
         <w:rPr>
           <w:b/>
@@ -6237,11 +6617,11 @@
       <w:bookmarkStart w:id="112" w:name="_Toc238553131"/>
       <w:bookmarkStart w:id="113" w:name="_Toc238553181"/>
       <w:bookmarkStart w:id="114" w:name="_Toc238553221"/>
-      <w:bookmarkStart w:id="115" w:name="_Toc238412458"/>
-      <w:bookmarkStart w:id="116" w:name="_Toc238413375"/>
-      <w:bookmarkStart w:id="117" w:name="_Toc238413448"/>
-      <w:bookmarkStart w:id="118" w:name="_Toc239100952"/>
-      <w:bookmarkStart w:id="119" w:name="_Toc239101035"/>
+      <w:bookmarkStart w:id="115" w:name="_Toc239100952"/>
+      <w:bookmarkStart w:id="116" w:name="_Toc239101035"/>
+      <w:bookmarkStart w:id="117" w:name="_Toc238412458"/>
+      <w:bookmarkStart w:id="118" w:name="_Toc238413375"/>
+      <w:bookmarkStart w:id="119" w:name="_Toc238413448"/>
       <w:r>
         <w:rPr>
           <w:rFonts w:eastAsia="Calibri"/>
@@ -6295,8 +6675,8 @@
       <w:bookmarkEnd w:id="112"/>
       <w:bookmarkEnd w:id="113"/>
       <w:bookmarkEnd w:id="114"/>
-      <w:bookmarkEnd w:id="118"/>
-      <w:bookmarkEnd w:id="119"/>
+      <w:bookmarkEnd w:id="115"/>
+      <w:bookmarkEnd w:id="116"/>
       <w:r>
         <w:rPr>
           <w:sz w:val="24"/>
@@ -6628,9 +7008,9 @@
       <w:bookmarkStart w:id="120" w:name="_Toc238412459"/>
       <w:bookmarkStart w:id="121" w:name="_Toc238413376"/>
       <w:bookmarkStart w:id="122" w:name="_Toc238413449"/>
-      <w:bookmarkEnd w:id="115"/>
-      <w:bookmarkEnd w:id="116"/>
       <w:bookmarkEnd w:id="117"/>
+      <w:bookmarkEnd w:id="118"/>
+      <w:bookmarkEnd w:id="119"/>
     </w:p>
     <w:p>
       <w:pPr>
@@ -9832,7 +10212,7 @@
             <w:sz w:val="24"/>
             <w:szCs w:val="24"/>
           </w:rPr>
-          <w:t>8</w:t>
+          <w:t>7</w:t>
         </w:r>
         <w:r>
           <w:rPr>
@@ -14771,7 +15151,7 @@
   <w:style w:type="paragraph" w:default="1" w:styleId="Normal">
     <w:name w:val="Normal"/>
     <w:qFormat/>
-    <w:rsid w:val="002C7177"/>
+    <w:rsid w:val="00696D8E"/>
   </w:style>
   <w:style w:type="paragraph" w:styleId="Titre1">
     <w:name w:val="heading 1"/>

</xml_diff>